<commit_message>
Styled upload receipt button, added disclaimer, and aligned edit and delete buttons.
</commit_message>
<xml_diff>
--- a/docs/phase3/team-contribution.docx
+++ b/docs/phase3/team-contribution.docx
@@ -1,6 +1,6 @@
 
 <file path=word/document.xml><?xml version="1.0" encoding="utf-8"?>
-<w:document xmlns:wpc="http://schemas.microsoft.com/office/word/2010/wordprocessingCanvas" xmlns:cx="http://schemas.microsoft.com/office/drawing/2014/chartex" xmlns:cx1="http://schemas.microsoft.com/office/drawing/2015/9/8/chartex" xmlns:cx2="http://schemas.microsoft.com/office/drawing/2015/10/21/chartex" xmlns:cx3="http://schemas.microsoft.com/office/drawing/2016/5/9/chartex" xmlns:cx4="http://schemas.microsoft.com/office/drawing/2016/5/10/chartex" xmlns:cx5="http://schemas.microsoft.com/office/drawing/2016/5/11/chartex" xmlns:cx6="http://schemas.microsoft.com/office/drawing/2016/5/12/chartex" xmlns:cx7="http://schemas.microsoft.com/office/drawing/2016/5/13/chartex" xmlns:cx8="http://schemas.microsoft.com/office/drawing/2016/5/14/chartex" xmlns:mc="http://schemas.openxmlformats.org/markup-compatibility/2006" xmlns:aink="http://schemas.microsoft.com/office/drawing/2016/ink" xmlns:am3d="http://schemas.microsoft.com/office/drawing/2017/model3d" xmlns:o="urn:schemas-microsoft-com:office:office" xmlns:oel="http://schemas.microsoft.com/office/2019/extlst" xmlns:r="http://schemas.openxmlformats.org/officeDocument/2006/relationships" xmlns:m="http://schemas.openxmlformats.org/officeDocument/2006/math" xmlns:v="urn:schemas-microsoft-com:vml" xmlns:wp14="http://schemas.microsoft.com/office/word/2010/wordprocessingDrawing" xmlns:wp="http://schemas.openxmlformats.org/drawingml/2006/wordprocessingDrawing" xmlns:w10="urn:schemas-microsoft-com:office:word" xmlns:w="http://schemas.openxmlformats.org/wordprocessingml/2006/main" xmlns:w14="http://schemas.microsoft.com/office/word/2010/wordml" xmlns:w15="http://schemas.microsoft.com/office/word/2012/wordml" xmlns:w16cex="http://schemas.microsoft.com/office/word/2018/wordml/cex" xmlns:w16cid="http://schemas.microsoft.com/office/word/2016/wordml/cid" xmlns:w16="http://schemas.microsoft.com/office/word/2018/wordml" xmlns:w16du="http://schemas.microsoft.com/office/word/2023/wordml/word16du" xmlns:w16sdtdh="http://schemas.microsoft.com/office/word/2020/wordml/sdtdatahash" xmlns:w16sdtfl="http://schemas.microsoft.com/office/word/2024/wordml/sdtformatlock" xmlns:w16se="http://schemas.microsoft.com/office/word/2015/wordml/symex" xmlns:wpg="http://schemas.microsoft.com/office/word/2010/wordprocessingGroup" xmlns:wpi="http://schemas.microsoft.com/office/word/2010/wordprocessingInk" xmlns:wne="http://schemas.microsoft.com/office/word/2006/wordml" xmlns:wps="http://schemas.microsoft.com/office/word/2010/wordprocessingShape" mc:Ignorable="w14 w15 w16se w16cid w16 w16cex w16sdtdh w16sdtfl w16du wp14">
+<w:document xmlns:wpc="http://schemas.microsoft.com/office/word/2010/wordprocessingCanvas" xmlns:cx="http://schemas.microsoft.com/office/drawing/2014/chartex" xmlns:cx1="http://schemas.microsoft.com/office/drawing/2015/9/8/chartex" xmlns:cx2="http://schemas.microsoft.com/office/drawing/2015/10/21/chartex" xmlns:cx3="http://schemas.microsoft.com/office/drawing/2016/5/9/chartex" xmlns:cx4="http://schemas.microsoft.com/office/drawing/2016/5/10/chartex" xmlns:cx5="http://schemas.microsoft.com/office/drawing/2016/5/11/chartex" xmlns:cx6="http://schemas.microsoft.com/office/drawing/2016/5/12/chartex" xmlns:cx7="http://schemas.microsoft.com/office/drawing/2016/5/13/chartex" xmlns:cx8="http://schemas.microsoft.com/office/drawing/2016/5/14/chartex" xmlns:mc="http://schemas.openxmlformats.org/markup-compatibility/2006" xmlns:aink="http://schemas.microsoft.com/office/drawing/2016/ink" xmlns:am3d="http://schemas.microsoft.com/office/drawing/2017/model3d" xmlns:o="urn:schemas-microsoft-com:office:office" xmlns:oel="http://schemas.microsoft.com/office/2019/extlst" xmlns:r="http://schemas.openxmlformats.org/officeDocument/2006/relationships" xmlns:m="http://schemas.openxmlformats.org/officeDocument/2006/math" xmlns:v="urn:schemas-microsoft-com:vml" xmlns:wp14="http://schemas.microsoft.com/office/word/2010/wordprocessingDrawing" xmlns:wp="http://schemas.openxmlformats.org/drawingml/2006/wordprocessingDrawing" xmlns:w10="urn:schemas-microsoft-com:office:word" xmlns:w="http://schemas.openxmlformats.org/wordprocessingml/2006/main" xmlns:w14="http://schemas.microsoft.com/office/word/2010/wordml" xmlns:w15="http://schemas.microsoft.com/office/word/2012/wordml" xmlns:w16cex="http://schemas.microsoft.com/office/word/2018/wordml/cex" xmlns:w16cid="http://schemas.microsoft.com/office/word/2016/wordml/cid" xmlns:w16="http://schemas.microsoft.com/office/word/2018/wordml" xmlns:w16du="http://schemas.microsoft.com/office/word/2023/wordml/word16du" xmlns:w16sdtdh="http://schemas.microsoft.com/office/word/2020/wordml/sdtdatahash" xmlns:w16se="http://schemas.microsoft.com/office/word/2015/wordml/symex" xmlns:wpg="http://schemas.microsoft.com/office/word/2010/wordprocessingGroup" xmlns:wpi="http://schemas.microsoft.com/office/word/2010/wordprocessingInk" xmlns:wne="http://schemas.microsoft.com/office/word/2006/wordml" xmlns:wps="http://schemas.microsoft.com/office/word/2010/wordprocessingShape" mc:Ignorable="w14 w15 w16se w16cid w16 w16cex w16sdtdh w16du wp14">
   <w:body>
     <w:p>
       <w:pPr>
@@ -415,67 +415,7 @@
           <w:kern w:val="0"/>
           <w14:ligatures w14:val="none"/>
         </w:rPr>
-        <w:t xml:space="preserve">Created and </w:t>
-      </w:r>
-      <w:proofErr w:type="gramStart"/>
-      <w:r>
-        <w:rPr>
-          <w:rFonts w:ascii="Times New Roman" w:eastAsia="Times New Roman" w:hAnsi="Times New Roman" w:cs="Times New Roman"/>
-          <w:color w:val="0F1115"/>
-          <w:kern w:val="0"/>
-          <w14:ligatures w14:val="none"/>
-        </w:rPr>
-        <w:t>setup .env</w:t>
-      </w:r>
-      <w:proofErr w:type="gramEnd"/>
-      <w:r>
-        <w:rPr>
-          <w:rFonts w:ascii="Times New Roman" w:eastAsia="Times New Roman" w:hAnsi="Times New Roman" w:cs="Times New Roman"/>
-          <w:color w:val="0F1115"/>
-          <w:kern w:val="0"/>
-          <w14:ligatures w14:val="none"/>
-        </w:rPr>
-        <w:t xml:space="preserve"> </w:t>
-      </w:r>
-      <w:proofErr w:type="gramStart"/>
-      <w:r>
-        <w:rPr>
-          <w:rFonts w:ascii="Times New Roman" w:eastAsia="Times New Roman" w:hAnsi="Times New Roman" w:cs="Times New Roman"/>
-          <w:color w:val="0F1115"/>
-          <w:kern w:val="0"/>
-          <w14:ligatures w14:val="none"/>
-        </w:rPr>
-        <w:t>and .</w:t>
-      </w:r>
-      <w:proofErr w:type="spellStart"/>
-      <w:r>
-        <w:rPr>
-          <w:rFonts w:ascii="Times New Roman" w:eastAsia="Times New Roman" w:hAnsi="Times New Roman" w:cs="Times New Roman"/>
-          <w:color w:val="0F1115"/>
-          <w:kern w:val="0"/>
-          <w14:ligatures w14:val="none"/>
-        </w:rPr>
-        <w:t>env</w:t>
-      </w:r>
-      <w:proofErr w:type="gramEnd"/>
-      <w:r>
-        <w:rPr>
-          <w:rFonts w:ascii="Times New Roman" w:eastAsia="Times New Roman" w:hAnsi="Times New Roman" w:cs="Times New Roman"/>
-          <w:color w:val="0F1115"/>
-          <w:kern w:val="0"/>
-          <w14:ligatures w14:val="none"/>
-        </w:rPr>
-        <w:t>.example</w:t>
-      </w:r>
-      <w:proofErr w:type="spellEnd"/>
-      <w:r>
-        <w:rPr>
-          <w:rFonts w:ascii="Times New Roman" w:eastAsia="Times New Roman" w:hAnsi="Times New Roman" w:cs="Times New Roman"/>
-          <w:color w:val="0F1115"/>
-          <w:kern w:val="0"/>
-          <w14:ligatures w14:val="none"/>
-        </w:rPr>
-        <w:t xml:space="preserve"> for storing environment variables</w:t>
+        <w:t>Created and setup .env and .env.example for storing environment variables</w:t>
       </w:r>
     </w:p>
     <w:p>
@@ -501,27 +441,7 @@
           <w:kern w:val="0"/>
           <w14:ligatures w14:val="none"/>
         </w:rPr>
-        <w:t xml:space="preserve">Improved security of web </w:t>
-      </w:r>
-      <w:proofErr w:type="gramStart"/>
-      <w:r>
-        <w:rPr>
-          <w:rFonts w:ascii="Times New Roman" w:eastAsia="Times New Roman" w:hAnsi="Times New Roman" w:cs="Times New Roman"/>
-          <w:color w:val="0F1115"/>
-          <w:kern w:val="0"/>
-          <w14:ligatures w14:val="none"/>
-        </w:rPr>
-        <w:t>app</w:t>
-      </w:r>
-      <w:proofErr w:type="gramEnd"/>
-      <w:r>
-        <w:rPr>
-          <w:rFonts w:ascii="Times New Roman" w:eastAsia="Times New Roman" w:hAnsi="Times New Roman" w:cs="Times New Roman"/>
-          <w:color w:val="0F1115"/>
-          <w:kern w:val="0"/>
-          <w14:ligatures w14:val="none"/>
-        </w:rPr>
-        <w:t xml:space="preserve"> through various </w:t>
+        <w:t xml:space="preserve">Improved security of web app through various </w:t>
       </w:r>
       <w:r>
         <w:rPr>
@@ -814,7 +734,6 @@
           <w14:ligatures w14:val="none"/>
         </w:rPr>
       </w:pPr>
-      <w:proofErr w:type="spellStart"/>
       <w:r>
         <w:rPr>
           <w:rFonts w:ascii="Times New Roman" w:eastAsia="Times New Roman" w:hAnsi="Times New Roman" w:cs="Times New Roman"/>
@@ -824,19 +743,7 @@
           <w:kern w:val="0"/>
           <w14:ligatures w14:val="none"/>
         </w:rPr>
-        <w:t>Roumaysae</w:t>
-      </w:r>
-      <w:proofErr w:type="spellEnd"/>
-      <w:r>
-        <w:rPr>
-          <w:rFonts w:ascii="Times New Roman" w:eastAsia="Times New Roman" w:hAnsi="Times New Roman" w:cs="Times New Roman"/>
-          <w:b/>
-          <w:bCs/>
-          <w:color w:val="0F1115"/>
-          <w:kern w:val="0"/>
-          <w14:ligatures w14:val="none"/>
-        </w:rPr>
-        <w:t xml:space="preserve"> Jerari</w:t>
+        <w:t>Roumaysae Jerari</w:t>
       </w:r>
       <w:r>
         <w:rPr>
@@ -869,23 +776,7 @@
           <w:rFonts w:ascii="Times New Roman" w:hAnsi="Times New Roman" w:cs="Times New Roman"/>
           <w:color w:val="0F1115"/>
         </w:rPr>
-        <w:t xml:space="preserve">1. Receipt Upload Button &amp; </w:t>
-      </w:r>
-      <w:proofErr w:type="spellStart"/>
-      <w:r>
-        <w:rPr>
-          <w:rFonts w:ascii="Times New Roman" w:hAnsi="Times New Roman" w:cs="Times New Roman"/>
-          <w:color w:val="0F1115"/>
-        </w:rPr>
-        <w:t>Veryfi</w:t>
-      </w:r>
-      <w:proofErr w:type="spellEnd"/>
-      <w:r>
-        <w:rPr>
-          <w:rFonts w:ascii="Times New Roman" w:hAnsi="Times New Roman" w:cs="Times New Roman"/>
-          <w:color w:val="0F1115"/>
-        </w:rPr>
-        <w:t xml:space="preserve"> Integration:</w:t>
+        <w:t>1. Receipt Upload Button &amp; Veryfi Integration:</w:t>
       </w:r>
     </w:p>
     <w:p>
@@ -903,21 +794,7 @@
         <w:rPr>
           <w:color w:val="0F1115"/>
         </w:rPr>
-        <w:t xml:space="preserve">Added an "Upload Receipt" button to the dashboard and connected </w:t>
-      </w:r>
-      <w:proofErr w:type="spellStart"/>
-      <w:r>
-        <w:rPr>
-          <w:color w:val="0F1115"/>
-        </w:rPr>
-        <w:t>Veryfi</w:t>
-      </w:r>
-      <w:proofErr w:type="spellEnd"/>
-      <w:r>
-        <w:rPr>
-          <w:color w:val="0F1115"/>
-        </w:rPr>
-        <w:t xml:space="preserve"> API to read text   from receipt images, fixing file paths so images upload correctly.</w:t>
+        <w:t>Added an "Upload Receipt" button to the dashboard and connected Veryfi API to read text   from receipt images, fixing file paths so images upload correctly.</w:t>
       </w:r>
     </w:p>
     <w:p>
@@ -952,19 +829,11 @@
           <w:color w:val="0F1115"/>
         </w:rPr>
       </w:pPr>
-      <w:proofErr w:type="gramStart"/>
-      <w:r>
-        <w:rPr>
-          <w:color w:val="0F1115"/>
-        </w:rPr>
-        <w:t>Saved receipt data</w:t>
-      </w:r>
-      <w:proofErr w:type="gramEnd"/>
-      <w:r>
-        <w:rPr>
-          <w:color w:val="0F1115"/>
-        </w:rPr>
-        <w:t xml:space="preserve"> (vendor, date, total amount) to the </w:t>
+      <w:r>
+        <w:rPr>
+          <w:color w:val="0F1115"/>
+        </w:rPr>
+        <w:t>Saved receipt data (vendor, date, total amount) to the </w:t>
       </w:r>
       <w:r>
         <w:t>receipts</w:t>
@@ -1014,11 +883,9 @@
         </w:rPr>
         <w:t>Created </w:t>
       </w:r>
-      <w:proofErr w:type="spellStart"/>
       <w:r>
         <w:t>receipt_line_items</w:t>
       </w:r>
-      <w:proofErr w:type="spellEnd"/>
       <w:r>
         <w:rPr>
           <w:color w:val="0F1115"/>
@@ -1152,11 +1019,9 @@
         <w:lastRenderedPageBreak/>
         <w:t>Added a "Send Feedback" button, created a popup modal form, and connected it to the </w:t>
       </w:r>
-      <w:proofErr w:type="spellStart"/>
       <w:r>
         <w:t>users_feedbackss</w:t>
       </w:r>
-      <w:proofErr w:type="spellEnd"/>
       <w:r>
         <w:rPr>
           <w:color w:val="0F1115"/>
@@ -1362,6 +1227,57 @@
           <w:color w:val="0F1115"/>
         </w:rPr>
         <w:t>10. added the ability to edit/delete existing expenses and incomes directly from the dashboard.</w:t>
+      </w:r>
+    </w:p>
+    <w:p>
+      <w:pPr>
+        <w:pStyle w:val="ds-markdown-paragraph"/>
+        <w:numPr>
+          <w:ilvl w:val="0"/>
+          <w:numId w:val="2"/>
+        </w:numPr>
+        <w:shd w:val="clear" w:color="auto" w:fill="FFFFFF"/>
+        <w:spacing w:before="240" w:beforeAutospacing="0" w:after="240" w:afterAutospacing="0" w:line="360" w:lineRule="auto"/>
+        <w:jc w:val="both"/>
+        <w:rPr>
+          <w:color w:val="0F1115"/>
+        </w:rPr>
+      </w:pPr>
+      <w:r>
+        <w:rPr>
+          <w:color w:val="0F1115"/>
+        </w:rPr>
+        <w:t xml:space="preserve">11. </w:t>
+      </w:r>
+      <w:r>
+        <w:rPr>
+          <w:color w:val="0F1115"/>
+        </w:rPr>
+        <w:t>Style</w:t>
+      </w:r>
+      <w:r>
+        <w:rPr>
+          <w:color w:val="0F1115"/>
+        </w:rPr>
+        <w:t>d</w:t>
+      </w:r>
+      <w:r>
+        <w:rPr>
+          <w:color w:val="0F1115"/>
+        </w:rPr>
+        <w:t xml:space="preserve"> Upload</w:t>
+      </w:r>
+      <w:r>
+        <w:rPr>
+          <w:color w:val="0F1115"/>
+        </w:rPr>
+        <w:t>ed</w:t>
+      </w:r>
+      <w:r>
+        <w:rPr>
+          <w:color w:val="0F1115"/>
+        </w:rPr>
+        <w:t xml:space="preserve"> Receipt button to match Add Transaction button and add disclaimer</w:t>
       </w:r>
     </w:p>
     <w:p>
@@ -1476,7 +1392,7 @@
 </file>
 
 <file path=word/numbering.xml><?xml version="1.0" encoding="utf-8"?>
-<w:numbering xmlns:wpc="http://schemas.microsoft.com/office/word/2010/wordprocessingCanvas" xmlns:cx="http://schemas.microsoft.com/office/drawing/2014/chartex" xmlns:cx1="http://schemas.microsoft.com/office/drawing/2015/9/8/chartex" xmlns:cx2="http://schemas.microsoft.com/office/drawing/2015/10/21/chartex" xmlns:cx3="http://schemas.microsoft.com/office/drawing/2016/5/9/chartex" xmlns:cx4="http://schemas.microsoft.com/office/drawing/2016/5/10/chartex" xmlns:cx5="http://schemas.microsoft.com/office/drawing/2016/5/11/chartex" xmlns:cx6="http://schemas.microsoft.com/office/drawing/2016/5/12/chartex" xmlns:cx7="http://schemas.microsoft.com/office/drawing/2016/5/13/chartex" xmlns:cx8="http://schemas.microsoft.com/office/drawing/2016/5/14/chartex" xmlns:mc="http://schemas.openxmlformats.org/markup-compatibility/2006" xmlns:aink="http://schemas.microsoft.com/office/drawing/2016/ink" xmlns:am3d="http://schemas.microsoft.com/office/drawing/2017/model3d" xmlns:o="urn:schemas-microsoft-com:office:office" xmlns:oel="http://schemas.microsoft.com/office/2019/extlst" xmlns:r="http://schemas.openxmlformats.org/officeDocument/2006/relationships" xmlns:m="http://schemas.openxmlformats.org/officeDocument/2006/math" xmlns:v="urn:schemas-microsoft-com:vml" xmlns:wp14="http://schemas.microsoft.com/office/word/2010/wordprocessingDrawing" xmlns:wp="http://schemas.openxmlformats.org/drawingml/2006/wordprocessingDrawing" xmlns:w10="urn:schemas-microsoft-com:office:word" xmlns:w="http://schemas.openxmlformats.org/wordprocessingml/2006/main" xmlns:w14="http://schemas.microsoft.com/office/word/2010/wordml" xmlns:w15="http://schemas.microsoft.com/office/word/2012/wordml" xmlns:w16cex="http://schemas.microsoft.com/office/word/2018/wordml/cex" xmlns:w16cid="http://schemas.microsoft.com/office/word/2016/wordml/cid" xmlns:w16="http://schemas.microsoft.com/office/word/2018/wordml" xmlns:w16du="http://schemas.microsoft.com/office/word/2023/wordml/word16du" xmlns:w16sdtdh="http://schemas.microsoft.com/office/word/2020/wordml/sdtdatahash" xmlns:w16sdtfl="http://schemas.microsoft.com/office/word/2024/wordml/sdtformatlock" xmlns:w16se="http://schemas.microsoft.com/office/word/2015/wordml/symex" xmlns:wpg="http://schemas.microsoft.com/office/word/2010/wordprocessingGroup" xmlns:wpi="http://schemas.microsoft.com/office/word/2010/wordprocessingInk" xmlns:wne="http://schemas.microsoft.com/office/word/2006/wordml" xmlns:wps="http://schemas.microsoft.com/office/word/2010/wordprocessingShape" mc:Ignorable="w14 w15 w16se w16cid w16 w16cex w16sdtdh w16sdtfl w16du wp14">
+<w:numbering xmlns:wpc="http://schemas.microsoft.com/office/word/2010/wordprocessingCanvas" xmlns:cx="http://schemas.microsoft.com/office/drawing/2014/chartex" xmlns:cx1="http://schemas.microsoft.com/office/drawing/2015/9/8/chartex" xmlns:cx2="http://schemas.microsoft.com/office/drawing/2015/10/21/chartex" xmlns:cx3="http://schemas.microsoft.com/office/drawing/2016/5/9/chartex" xmlns:cx4="http://schemas.microsoft.com/office/drawing/2016/5/10/chartex" xmlns:cx5="http://schemas.microsoft.com/office/drawing/2016/5/11/chartex" xmlns:cx6="http://schemas.microsoft.com/office/drawing/2016/5/12/chartex" xmlns:cx7="http://schemas.microsoft.com/office/drawing/2016/5/13/chartex" xmlns:cx8="http://schemas.microsoft.com/office/drawing/2016/5/14/chartex" xmlns:mc="http://schemas.openxmlformats.org/markup-compatibility/2006" xmlns:aink="http://schemas.microsoft.com/office/drawing/2016/ink" xmlns:am3d="http://schemas.microsoft.com/office/drawing/2017/model3d" xmlns:o="urn:schemas-microsoft-com:office:office" xmlns:oel="http://schemas.microsoft.com/office/2019/extlst" xmlns:r="http://schemas.openxmlformats.org/officeDocument/2006/relationships" xmlns:m="http://schemas.openxmlformats.org/officeDocument/2006/math" xmlns:v="urn:schemas-microsoft-com:vml" xmlns:wp14="http://schemas.microsoft.com/office/word/2010/wordprocessingDrawing" xmlns:wp="http://schemas.openxmlformats.org/drawingml/2006/wordprocessingDrawing" xmlns:w10="urn:schemas-microsoft-com:office:word" xmlns:w="http://schemas.openxmlformats.org/wordprocessingml/2006/main" xmlns:w14="http://schemas.microsoft.com/office/word/2010/wordml" xmlns:w15="http://schemas.microsoft.com/office/word/2012/wordml" xmlns:w16cex="http://schemas.microsoft.com/office/word/2018/wordml/cex" xmlns:w16cid="http://schemas.microsoft.com/office/word/2016/wordml/cid" xmlns:w16="http://schemas.microsoft.com/office/word/2018/wordml" xmlns:w16du="http://schemas.microsoft.com/office/word/2023/wordml/word16du" xmlns:w16sdtdh="http://schemas.microsoft.com/office/word/2020/wordml/sdtdatahash" xmlns:w16se="http://schemas.microsoft.com/office/word/2015/wordml/symex" xmlns:wpg="http://schemas.microsoft.com/office/word/2010/wordprocessingGroup" xmlns:wpi="http://schemas.microsoft.com/office/word/2010/wordprocessingInk" xmlns:wne="http://schemas.microsoft.com/office/word/2006/wordml" xmlns:wps="http://schemas.microsoft.com/office/word/2010/wordprocessingShape" mc:Ignorable="w14 w15 w16se w16cid w16 w16cex w16sdtdh w16du wp14">
   <w:abstractNum w:abstractNumId="0" w15:restartNumberingAfterBreak="0">
     <w:nsid w:val="14D14587"/>
     <w:multiLevelType w:val="multilevel"/>
@@ -1901,7 +1817,7 @@
 </file>
 
 <file path=word/styles.xml><?xml version="1.0" encoding="utf-8"?>
-<w:styles xmlns:mc="http://schemas.openxmlformats.org/markup-compatibility/2006" xmlns:r="http://schemas.openxmlformats.org/officeDocument/2006/relationships" xmlns:w="http://schemas.openxmlformats.org/wordprocessingml/2006/main" xmlns:w14="http://schemas.microsoft.com/office/word/2010/wordml" xmlns:w15="http://schemas.microsoft.com/office/word/2012/wordml" xmlns:w16cex="http://schemas.microsoft.com/office/word/2018/wordml/cex" xmlns:w16cid="http://schemas.microsoft.com/office/word/2016/wordml/cid" xmlns:w16="http://schemas.microsoft.com/office/word/2018/wordml" xmlns:w16du="http://schemas.microsoft.com/office/word/2023/wordml/word16du" xmlns:w16sdtdh="http://schemas.microsoft.com/office/word/2020/wordml/sdtdatahash" xmlns:w16sdtfl="http://schemas.microsoft.com/office/word/2024/wordml/sdtformatlock" xmlns:w16se="http://schemas.microsoft.com/office/word/2015/wordml/symex" mc:Ignorable="w14 w15 w16se w16cid w16 w16cex w16sdtdh w16sdtfl w16du">
+<w:styles xmlns:mc="http://schemas.openxmlformats.org/markup-compatibility/2006" xmlns:r="http://schemas.openxmlformats.org/officeDocument/2006/relationships" xmlns:w="http://schemas.openxmlformats.org/wordprocessingml/2006/main" xmlns:w14="http://schemas.microsoft.com/office/word/2010/wordml" xmlns:w15="http://schemas.microsoft.com/office/word/2012/wordml" xmlns:w16cex="http://schemas.microsoft.com/office/word/2018/wordml/cex" xmlns:w16cid="http://schemas.microsoft.com/office/word/2016/wordml/cid" xmlns:w16="http://schemas.microsoft.com/office/word/2018/wordml" xmlns:w16du="http://schemas.microsoft.com/office/word/2023/wordml/word16du" xmlns:w16sdtdh="http://schemas.microsoft.com/office/word/2020/wordml/sdtdatahash" xmlns:w16se="http://schemas.microsoft.com/office/word/2015/wordml/symex" mc:Ignorable="w14 w15 w16se w16cid w16 w16cex w16sdtdh w16du">
   <w:docDefaults>
     <w:rPrDefault>
       <w:rPr>

</xml_diff>

<commit_message>
Update my team contribution.
</commit_message>
<xml_diff>
--- a/docs/phase3/team-contribution.docx
+++ b/docs/phase3/team-contribution.docx
@@ -815,45 +815,33 @@
         <w:rPr>
           <w:color w:val="0F1115"/>
         </w:rPr>
-        <w:t>2. Save Receipt Data to Database</w:t>
+        <w:t xml:space="preserve">2. Save Receipt Data </w:t>
+      </w:r>
+      <w:r>
+        <w:rPr>
+          <w:color w:val="0F1115"/>
+        </w:rPr>
+        <w:t>(vendor, date, total amount) to the </w:t>
+      </w:r>
+      <w:r>
+        <w:t>receipts</w:t>
+      </w:r>
+      <w:r>
+        <w:rPr>
+          <w:color w:val="0F1115"/>
+        </w:rPr>
+        <w:t> table.</w:t>
       </w:r>
     </w:p>
     <w:p>
       <w:pPr>
         <w:pStyle w:val="ds-markdown-paragraph"/>
+        <w:numPr>
+          <w:ilvl w:val="0"/>
+          <w:numId w:val="2"/>
+        </w:numPr>
         <w:shd w:val="clear" w:color="auto" w:fill="FFFFFF"/>
         <w:spacing w:before="240" w:beforeAutospacing="0" w:after="240" w:afterAutospacing="0" w:line="360" w:lineRule="auto"/>
-        <w:ind w:left="720" w:firstLine="720"/>
-        <w:jc w:val="both"/>
-        <w:rPr>
-          <w:color w:val="0F1115"/>
-        </w:rPr>
-      </w:pPr>
-      <w:r>
-        <w:rPr>
-          <w:color w:val="0F1115"/>
-        </w:rPr>
-        <w:t>Saved receipt data (vendor, date, total amount) to the </w:t>
-      </w:r>
-      <w:r>
-        <w:t>receipts</w:t>
-      </w:r>
-      <w:r>
-        <w:rPr>
-          <w:color w:val="0F1115"/>
-        </w:rPr>
-        <w:t> table.</w:t>
-      </w:r>
-    </w:p>
-    <w:p>
-      <w:pPr>
-        <w:pStyle w:val="ds-markdown-paragraph"/>
-        <w:numPr>
-          <w:ilvl w:val="0"/>
-          <w:numId w:val="2"/>
-        </w:numPr>
-        <w:shd w:val="clear" w:color="auto" w:fill="FFFFFF"/>
-        <w:spacing w:before="240" w:beforeAutospacing="0" w:after="240" w:afterAutospacing="0" w:line="360" w:lineRule="auto"/>
         <w:jc w:val="both"/>
         <w:rPr>
           <w:color w:val="0F1115"/>
@@ -864,6 +852,12 @@
           <w:color w:val="0F1115"/>
         </w:rPr>
         <w:t>3. Store Individual Receipt Items</w:t>
+      </w:r>
+      <w:r>
+        <w:rPr>
+          <w:color w:val="0F1115"/>
+        </w:rPr>
+        <w:t>:</w:t>
       </w:r>
     </w:p>
     <w:p>
@@ -911,7 +905,70 @@
         <w:rPr>
           <w:color w:val="0F1115"/>
         </w:rPr>
-        <w:t>4. Display Receipt Items as Expenses</w:t>
+        <w:t xml:space="preserve">4. </w:t>
+      </w:r>
+      <w:r>
+        <w:rPr>
+          <w:color w:val="0F1115"/>
+        </w:rPr>
+        <w:t>Added code to save each receipt item as an expense in the </w:t>
+      </w:r>
+      <w:r>
+        <w:t>expenses</w:t>
+      </w:r>
+      <w:r>
+        <w:rPr>
+          <w:color w:val="0F1115"/>
+        </w:rPr>
+        <w:t> table so scanned items appear on the dashboard.</w:t>
+      </w:r>
+    </w:p>
+    <w:p>
+      <w:pPr>
+        <w:pStyle w:val="ds-markdown-paragraph"/>
+        <w:numPr>
+          <w:ilvl w:val="0"/>
+          <w:numId w:val="2"/>
+        </w:numPr>
+        <w:shd w:val="clear" w:color="auto" w:fill="FFFFFF"/>
+        <w:spacing w:before="240" w:beforeAutospacing="0" w:after="240" w:afterAutospacing="0" w:line="360" w:lineRule="auto"/>
+        <w:jc w:val="both"/>
+        <w:rPr>
+          <w:color w:val="0F1115"/>
+        </w:rPr>
+      </w:pPr>
+      <w:r>
+        <w:rPr>
+          <w:color w:val="0F1115"/>
+        </w:rPr>
+        <w:t xml:space="preserve">5. </w:t>
+      </w:r>
+      <w:r>
+        <w:rPr>
+          <w:color w:val="0F1115"/>
+        </w:rPr>
+        <w:t>Fixed the sorting so latest transactions show on top of the list.</w:t>
+      </w:r>
+    </w:p>
+    <w:p>
+      <w:pPr>
+        <w:pStyle w:val="ds-markdown-paragraph"/>
+        <w:numPr>
+          <w:ilvl w:val="0"/>
+          <w:numId w:val="2"/>
+        </w:numPr>
+        <w:shd w:val="clear" w:color="auto" w:fill="FFFFFF"/>
+        <w:spacing w:before="240" w:beforeAutospacing="0" w:after="240" w:afterAutospacing="0" w:line="360" w:lineRule="auto"/>
+        <w:jc w:val="both"/>
+        <w:rPr>
+          <w:color w:val="0F1115"/>
+        </w:rPr>
+      </w:pPr>
+      <w:r>
+        <w:rPr>
+          <w:color w:val="0F1115"/>
+        </w:rPr>
+        <w:t>6. Send Feedback Feature</w:t>
       </w:r>
     </w:p>
     <w:p>
@@ -929,76 +986,16 @@
         <w:rPr>
           <w:color w:val="0F1115"/>
         </w:rPr>
-        <w:t>Added code to save each receipt item as an expense in the </w:t>
-      </w:r>
-      <w:r>
-        <w:t>expenses</w:t>
-      </w:r>
-      <w:r>
-        <w:rPr>
-          <w:color w:val="0F1115"/>
-        </w:rPr>
-        <w:t> table so scanned items appear on the dashboard.</w:t>
-      </w:r>
-    </w:p>
-    <w:p>
-      <w:pPr>
-        <w:pStyle w:val="ds-markdown-paragraph"/>
-        <w:numPr>
-          <w:ilvl w:val="0"/>
-          <w:numId w:val="2"/>
-        </w:numPr>
-        <w:shd w:val="clear" w:color="auto" w:fill="FFFFFF"/>
-        <w:spacing w:before="240" w:beforeAutospacing="0" w:after="240" w:afterAutospacing="0" w:line="360" w:lineRule="auto"/>
-        <w:jc w:val="both"/>
-        <w:rPr>
-          <w:color w:val="0F1115"/>
-        </w:rPr>
-      </w:pPr>
-      <w:r>
-        <w:rPr>
-          <w:color w:val="0F1115"/>
-        </w:rPr>
-        <w:t>5. Fix Transaction Order</w:t>
-      </w:r>
-    </w:p>
-    <w:p>
-      <w:pPr>
-        <w:pStyle w:val="ds-markdown-paragraph"/>
-        <w:shd w:val="clear" w:color="auto" w:fill="FFFFFF"/>
-        <w:spacing w:before="240" w:beforeAutospacing="0" w:after="240" w:afterAutospacing="0" w:line="360" w:lineRule="auto"/>
-        <w:ind w:left="720" w:firstLine="720"/>
-        <w:jc w:val="both"/>
-        <w:rPr>
-          <w:color w:val="0F1115"/>
-        </w:rPr>
-      </w:pPr>
-      <w:r>
-        <w:rPr>
-          <w:color w:val="0F1115"/>
-        </w:rPr>
-        <w:t>Fixed the sorting so latest transactions show on top of the list.</w:t>
-      </w:r>
-    </w:p>
-    <w:p>
-      <w:pPr>
-        <w:pStyle w:val="ds-markdown-paragraph"/>
-        <w:numPr>
-          <w:ilvl w:val="0"/>
-          <w:numId w:val="2"/>
-        </w:numPr>
-        <w:shd w:val="clear" w:color="auto" w:fill="FFFFFF"/>
-        <w:spacing w:before="240" w:beforeAutospacing="0" w:after="240" w:afterAutospacing="0" w:line="360" w:lineRule="auto"/>
-        <w:jc w:val="both"/>
-        <w:rPr>
-          <w:color w:val="0F1115"/>
-        </w:rPr>
-      </w:pPr>
-      <w:r>
-        <w:rPr>
-          <w:color w:val="0F1115"/>
-        </w:rPr>
-        <w:t>6. Send Feedback Feature</w:t>
+        <w:t>Added a "Send Feedback" button, created a popup modal form, and connected it to the </w:t>
+      </w:r>
+      <w:r>
+        <w:t>users_feedbackss</w:t>
+      </w:r>
+      <w:r>
+        <w:rPr>
+          <w:color w:val="0F1115"/>
+        </w:rPr>
+        <w:t> table in the database.</w:t>
       </w:r>
     </w:p>
     <w:p>
@@ -1012,43 +1009,6 @@
           <w:color w:val="0F1115"/>
         </w:rPr>
       </w:pPr>
-      <w:r>
-        <w:rPr>
-          <w:color w:val="0F1115"/>
-        </w:rPr>
-        <w:lastRenderedPageBreak/>
-        <w:t>Added a "Send Feedback" button, created a popup modal form, and connected it to the </w:t>
-      </w:r>
-      <w:r>
-        <w:t>users_feedbackss</w:t>
-      </w:r>
-      <w:r>
-        <w:rPr>
-          <w:color w:val="0F1115"/>
-        </w:rPr>
-        <w:t> table in the database.</w:t>
-      </w:r>
-    </w:p>
-    <w:p>
-      <w:pPr>
-        <w:pStyle w:val="ds-markdown-paragraph"/>
-        <w:numPr>
-          <w:ilvl w:val="0"/>
-          <w:numId w:val="2"/>
-        </w:numPr>
-        <w:shd w:val="clear" w:color="auto" w:fill="FFFFFF"/>
-        <w:spacing w:before="240" w:beforeAutospacing="0" w:after="240" w:afterAutospacing="0" w:line="360" w:lineRule="auto"/>
-        <w:jc w:val="both"/>
-        <w:rPr>
-          <w:color w:val="0F1115"/>
-        </w:rPr>
-      </w:pPr>
-      <w:r>
-        <w:rPr>
-          <w:color w:val="0F1115"/>
-        </w:rPr>
-        <w:t>7. Fix Feedback Form Issues</w:t>
-      </w:r>
     </w:p>
     <w:p>
       <w:pPr>
@@ -1061,12 +1021,6 @@
           <w:color w:val="0F1115"/>
         </w:rPr>
       </w:pPr>
-      <w:r>
-        <w:rPr>
-          <w:color w:val="0F1115"/>
-        </w:rPr>
-        <w:t>Fixed modal to close after submitting, clear old messages, and corrected the "Bearer" space issue in the authorization header.</w:t>
-      </w:r>
     </w:p>
     <w:p>
       <w:pPr>
@@ -1086,7 +1040,8 @@
         <w:rPr>
           <w:color w:val="0F1115"/>
         </w:rPr>
-        <w:t>8. Database Setup &amp; Security</w:t>
+        <w:lastRenderedPageBreak/>
+        <w:t>7. Fix Feedback Form Issues</w:t>
       </w:r>
     </w:p>
     <w:p>
@@ -1095,78 +1050,16 @@
         <w:shd w:val="clear" w:color="auto" w:fill="FFFFFF"/>
         <w:spacing w:before="240" w:beforeAutospacing="0" w:after="240" w:afterAutospacing="0" w:line="360" w:lineRule="auto"/>
         <w:ind w:left="1440"/>
-        <w:rPr>
-          <w:color w:val="0F1115"/>
-        </w:rPr>
-      </w:pPr>
-      <w:r>
-        <w:rPr>
-          <w:color w:val="0F1115"/>
-        </w:rPr>
-        <w:t>Created all tables (</w:t>
-      </w:r>
-      <w:r>
-        <w:t>users</w:t>
-      </w:r>
-      <w:r>
-        <w:rPr>
-          <w:color w:val="0F1115"/>
-        </w:rPr>
-        <w:t>, </w:t>
-      </w:r>
-      <w:r>
-        <w:t>categories</w:t>
-      </w:r>
-      <w:r>
-        <w:rPr>
-          <w:color w:val="0F1115"/>
-        </w:rPr>
-        <w:t>, </w:t>
-      </w:r>
-      <w:r>
-        <w:t>expenses</w:t>
-      </w:r>
-      <w:r>
-        <w:rPr>
-          <w:color w:val="0F1115"/>
-        </w:rPr>
-        <w:t>, </w:t>
-      </w:r>
-      <w:r>
-        <w:t>incomes</w:t>
-      </w:r>
-      <w:r>
-        <w:rPr>
-          <w:color w:val="0F1115"/>
-        </w:rPr>
-        <w:t>, </w:t>
-      </w:r>
-      <w:r>
-        <w:t>receipts</w:t>
-      </w:r>
-      <w:r>
-        <w:rPr>
-          <w:color w:val="0F1115"/>
-        </w:rPr>
-        <w:t>, </w:t>
-      </w:r>
-      <w:r>
-        <w:t>receipt_line_items</w:t>
-      </w:r>
-      <w:r>
-        <w:rPr>
-          <w:color w:val="0F1115"/>
-        </w:rPr>
-        <w:t>, </w:t>
-      </w:r>
-      <w:r>
-        <w:t>users_feedbackss</w:t>
-      </w:r>
-      <w:r>
-        <w:rPr>
-          <w:color w:val="0F1115"/>
-        </w:rPr>
-        <w:t>), added foreign keys, and hashed user passwords for security.</w:t>
+        <w:jc w:val="both"/>
+        <w:rPr>
+          <w:color w:val="0F1115"/>
+        </w:rPr>
+      </w:pPr>
+      <w:r>
+        <w:rPr>
+          <w:color w:val="0F1115"/>
+        </w:rPr>
+        <w:t>Fixed modal to close after submitting, clear old messages, and corrected the "Bearer" space issue in the authorization header.</w:t>
       </w:r>
     </w:p>
     <w:p>
@@ -1187,25 +1080,46 @@
         <w:rPr>
           <w:color w:val="0F1115"/>
         </w:rPr>
-        <w:t>9. Testing &amp; Team Collaboration</w:t>
+        <w:t>8</w:t>
+      </w:r>
+      <w:r>
+        <w:rPr>
+          <w:color w:val="0F1115"/>
+        </w:rPr>
+        <w:t xml:space="preserve">. </w:t>
+      </w:r>
+      <w:r>
+        <w:rPr>
+          <w:color w:val="0F1115"/>
+        </w:rPr>
+        <w:t>Added sample data for testing, exported full database backup.</w:t>
       </w:r>
     </w:p>
     <w:p>
       <w:pPr>
         <w:pStyle w:val="ds-markdown-paragraph"/>
+        <w:numPr>
+          <w:ilvl w:val="0"/>
+          <w:numId w:val="2"/>
+        </w:numPr>
         <w:shd w:val="clear" w:color="auto" w:fill="FFFFFF"/>
         <w:spacing w:before="240" w:beforeAutospacing="0" w:after="240" w:afterAutospacing="0" w:line="360" w:lineRule="auto"/>
-        <w:ind w:left="1440"/>
-        <w:jc w:val="both"/>
-        <w:rPr>
-          <w:color w:val="0F1115"/>
-        </w:rPr>
-      </w:pPr>
-      <w:r>
-        <w:rPr>
-          <w:color w:val="0F1115"/>
-        </w:rPr>
-        <w:t>Added sample data for testing, exported full database backup.</w:t>
+        <w:jc w:val="both"/>
+        <w:rPr>
+          <w:color w:val="0F1115"/>
+        </w:rPr>
+      </w:pPr>
+      <w:r>
+        <w:rPr>
+          <w:color w:val="0F1115"/>
+        </w:rPr>
+        <w:t>9</w:t>
+      </w:r>
+      <w:r>
+        <w:rPr>
+          <w:color w:val="0F1115"/>
+        </w:rPr>
+        <w:t>. added the ability to edit/delete existing expenses and incomes directly from the dashboard.</w:t>
       </w:r>
     </w:p>
     <w:p>
@@ -1226,7 +1140,67 @@
         <w:rPr>
           <w:color w:val="0F1115"/>
         </w:rPr>
-        <w:t>10. added the ability to edit/delete existing expenses and incomes directly from the dashboard.</w:t>
+        <w:t>1</w:t>
+      </w:r>
+      <w:r>
+        <w:rPr>
+          <w:color w:val="0F1115"/>
+        </w:rPr>
+        <w:t>0</w:t>
+      </w:r>
+      <w:r>
+        <w:rPr>
+          <w:color w:val="0F1115"/>
+        </w:rPr>
+        <w:t xml:space="preserve">. </w:t>
+      </w:r>
+      <w:r>
+        <w:rPr>
+          <w:color w:val="0F1115"/>
+        </w:rPr>
+        <w:t>Style</w:t>
+      </w:r>
+      <w:r>
+        <w:rPr>
+          <w:color w:val="0F1115"/>
+        </w:rPr>
+        <w:t>d</w:t>
+      </w:r>
+      <w:r>
+        <w:rPr>
+          <w:color w:val="0F1115"/>
+        </w:rPr>
+        <w:t xml:space="preserve"> Upload</w:t>
+      </w:r>
+      <w:r>
+        <w:rPr>
+          <w:color w:val="0F1115"/>
+        </w:rPr>
+        <w:t>ed</w:t>
+      </w:r>
+      <w:r>
+        <w:rPr>
+          <w:color w:val="0F1115"/>
+        </w:rPr>
+        <w:t xml:space="preserve"> Receipt button to match Add Transaction button and add</w:t>
+      </w:r>
+      <w:r>
+        <w:rPr>
+          <w:color w:val="0F1115"/>
+        </w:rPr>
+        <w:t>ed</w:t>
+      </w:r>
+      <w:r>
+        <w:rPr>
+          <w:color w:val="0F1115"/>
+        </w:rPr>
+        <w:t xml:space="preserve"> disclaimer</w:t>
+      </w:r>
+      <w:r>
+        <w:rPr>
+          <w:color w:val="0F1115"/>
+        </w:rPr>
+        <w:t xml:space="preserve"> ( for AI scanner to the user ).</w:t>
       </w:r>
     </w:p>
     <w:p>
@@ -1247,37 +1221,37 @@
         <w:rPr>
           <w:color w:val="0F1115"/>
         </w:rPr>
-        <w:t xml:space="preserve">11. </w:t>
-      </w:r>
-      <w:r>
-        <w:rPr>
-          <w:color w:val="0F1115"/>
-        </w:rPr>
-        <w:t>Style</w:t>
-      </w:r>
-      <w:r>
-        <w:rPr>
-          <w:color w:val="0F1115"/>
-        </w:rPr>
-        <w:t>d</w:t>
-      </w:r>
-      <w:r>
-        <w:rPr>
-          <w:color w:val="0F1115"/>
-        </w:rPr>
-        <w:t xml:space="preserve"> Upload</w:t>
-      </w:r>
-      <w:r>
-        <w:rPr>
-          <w:color w:val="0F1115"/>
-        </w:rPr>
-        <w:t>ed</w:t>
-      </w:r>
-      <w:r>
-        <w:rPr>
-          <w:color w:val="0F1115"/>
-        </w:rPr>
-        <w:t xml:space="preserve"> Receipt button to match Add Transaction button and add disclaimer</w:t>
+        <w:t>1</w:t>
+      </w:r>
+      <w:r>
+        <w:rPr>
+          <w:color w:val="0F1115"/>
+        </w:rPr>
+        <w:t>1</w:t>
+      </w:r>
+      <w:r>
+        <w:rPr>
+          <w:color w:val="0F1115"/>
+        </w:rPr>
+        <w:t xml:space="preserve">. </w:t>
+      </w:r>
+      <w:r>
+        <w:rPr>
+          <w:color w:val="0F1115"/>
+        </w:rPr>
+        <w:t>Fix feedback dropdown sizing</w:t>
+      </w:r>
+      <w:r>
+        <w:rPr>
+          <w:color w:val="0F1115"/>
+        </w:rPr>
+        <w:t xml:space="preserve"> after CSS conflict, </w:t>
+      </w:r>
+      <w:r>
+        <w:rPr>
+          <w:color w:val="0F1115"/>
+        </w:rPr>
+        <w:t>Styled upload receipt button, added disclaimer, and aligned edit and delete buttons.</w:t>
       </w:r>
     </w:p>
     <w:p>

</xml_diff>

<commit_message>
Updated team contribution file
</commit_message>
<xml_diff>
--- a/docs/phase3/team-contribution.docx
+++ b/docs/phase3/team-contribution.docx
@@ -1,6 +1,6 @@
 
 <file path=word/document.xml><?xml version="1.0" encoding="utf-8"?>
-<w:document xmlns:wpc="http://schemas.microsoft.com/office/word/2010/wordprocessingCanvas" xmlns:cx="http://schemas.microsoft.com/office/drawing/2014/chartex" xmlns:cx1="http://schemas.microsoft.com/office/drawing/2015/9/8/chartex" xmlns:cx2="http://schemas.microsoft.com/office/drawing/2015/10/21/chartex" xmlns:cx3="http://schemas.microsoft.com/office/drawing/2016/5/9/chartex" xmlns:cx4="http://schemas.microsoft.com/office/drawing/2016/5/10/chartex" xmlns:cx5="http://schemas.microsoft.com/office/drawing/2016/5/11/chartex" xmlns:cx6="http://schemas.microsoft.com/office/drawing/2016/5/12/chartex" xmlns:cx7="http://schemas.microsoft.com/office/drawing/2016/5/13/chartex" xmlns:cx8="http://schemas.microsoft.com/office/drawing/2016/5/14/chartex" xmlns:mc="http://schemas.openxmlformats.org/markup-compatibility/2006" xmlns:aink="http://schemas.microsoft.com/office/drawing/2016/ink" xmlns:am3d="http://schemas.microsoft.com/office/drawing/2017/model3d" xmlns:o="urn:schemas-microsoft-com:office:office" xmlns:oel="http://schemas.microsoft.com/office/2019/extlst" xmlns:r="http://schemas.openxmlformats.org/officeDocument/2006/relationships" xmlns:m="http://schemas.openxmlformats.org/officeDocument/2006/math" xmlns:v="urn:schemas-microsoft-com:vml" xmlns:wp14="http://schemas.microsoft.com/office/word/2010/wordprocessingDrawing" xmlns:wp="http://schemas.openxmlformats.org/drawingml/2006/wordprocessingDrawing" xmlns:w10="urn:schemas-microsoft-com:office:word" xmlns:w="http://schemas.openxmlformats.org/wordprocessingml/2006/main" xmlns:w14="http://schemas.microsoft.com/office/word/2010/wordml" xmlns:w15="http://schemas.microsoft.com/office/word/2012/wordml" xmlns:w16cex="http://schemas.microsoft.com/office/word/2018/wordml/cex" xmlns:w16cid="http://schemas.microsoft.com/office/word/2016/wordml/cid" xmlns:w16="http://schemas.microsoft.com/office/word/2018/wordml" xmlns:w16du="http://schemas.microsoft.com/office/word/2023/wordml/word16du" xmlns:w16sdtdh="http://schemas.microsoft.com/office/word/2020/wordml/sdtdatahash" xmlns:w16se="http://schemas.microsoft.com/office/word/2015/wordml/symex" xmlns:wpg="http://schemas.microsoft.com/office/word/2010/wordprocessingGroup" xmlns:wpi="http://schemas.microsoft.com/office/word/2010/wordprocessingInk" xmlns:wne="http://schemas.microsoft.com/office/word/2006/wordml" xmlns:wps="http://schemas.microsoft.com/office/word/2010/wordprocessingShape" mc:Ignorable="w14 w15 w16se w16cid w16 w16cex w16sdtdh w16du wp14">
+<w:document xmlns:wpc="http://schemas.microsoft.com/office/word/2010/wordprocessingCanvas" xmlns:cx="http://schemas.microsoft.com/office/drawing/2014/chartex" xmlns:cx1="http://schemas.microsoft.com/office/drawing/2015/9/8/chartex" xmlns:cx2="http://schemas.microsoft.com/office/drawing/2015/10/21/chartex" xmlns:cx3="http://schemas.microsoft.com/office/drawing/2016/5/9/chartex" xmlns:cx4="http://schemas.microsoft.com/office/drawing/2016/5/10/chartex" xmlns:cx5="http://schemas.microsoft.com/office/drawing/2016/5/11/chartex" xmlns:cx6="http://schemas.microsoft.com/office/drawing/2016/5/12/chartex" xmlns:cx7="http://schemas.microsoft.com/office/drawing/2016/5/13/chartex" xmlns:cx8="http://schemas.microsoft.com/office/drawing/2016/5/14/chartex" xmlns:mc="http://schemas.openxmlformats.org/markup-compatibility/2006" xmlns:aink="http://schemas.microsoft.com/office/drawing/2016/ink" xmlns:am3d="http://schemas.microsoft.com/office/drawing/2017/model3d" xmlns:o="urn:schemas-microsoft-com:office:office" xmlns:oel="http://schemas.microsoft.com/office/2019/extlst" xmlns:r="http://schemas.openxmlformats.org/officeDocument/2006/relationships" xmlns:m="http://schemas.openxmlformats.org/officeDocument/2006/math" xmlns:v="urn:schemas-microsoft-com:vml" xmlns:wp14="http://schemas.microsoft.com/office/word/2010/wordprocessingDrawing" xmlns:wp="http://schemas.openxmlformats.org/drawingml/2006/wordprocessingDrawing" xmlns:w10="urn:schemas-microsoft-com:office:word" xmlns:w="http://schemas.openxmlformats.org/wordprocessingml/2006/main" xmlns:w14="http://schemas.microsoft.com/office/word/2010/wordml" xmlns:w15="http://schemas.microsoft.com/office/word/2012/wordml" xmlns:w16cex="http://schemas.microsoft.com/office/word/2018/wordml/cex" xmlns:w16cid="http://schemas.microsoft.com/office/word/2016/wordml/cid" xmlns:w16="http://schemas.microsoft.com/office/word/2018/wordml" xmlns:w16du="http://schemas.microsoft.com/office/word/2023/wordml/word16du" xmlns:w16sdtdh="http://schemas.microsoft.com/office/word/2020/wordml/sdtdatahash" xmlns:w16sdtfl="http://schemas.microsoft.com/office/word/2024/wordml/sdtformatlock" xmlns:w16se="http://schemas.microsoft.com/office/word/2015/wordml/symex" xmlns:wpg="http://schemas.microsoft.com/office/word/2010/wordprocessingGroup" xmlns:wpi="http://schemas.microsoft.com/office/word/2010/wordprocessingInk" xmlns:wne="http://schemas.microsoft.com/office/word/2006/wordml" xmlns:wps="http://schemas.microsoft.com/office/word/2010/wordprocessingShape" mc:Ignorable="w14 w15 w16se w16cid w16 w16cex w16sdtdh w16sdtfl w16du wp14">
   <w:body>
     <w:p>
       <w:pPr>
@@ -415,7 +415,67 @@
           <w:kern w:val="0"/>
           <w14:ligatures w14:val="none"/>
         </w:rPr>
-        <w:t>Created and setup .env and .env.example for storing environment variables</w:t>
+        <w:t xml:space="preserve">Created and </w:t>
+      </w:r>
+      <w:proofErr w:type="gramStart"/>
+      <w:r>
+        <w:rPr>
+          <w:rFonts w:ascii="Times New Roman" w:eastAsia="Times New Roman" w:hAnsi="Times New Roman" w:cs="Times New Roman"/>
+          <w:color w:val="0F1115"/>
+          <w:kern w:val="0"/>
+          <w14:ligatures w14:val="none"/>
+        </w:rPr>
+        <w:t>setup .env</w:t>
+      </w:r>
+      <w:proofErr w:type="gramEnd"/>
+      <w:r>
+        <w:rPr>
+          <w:rFonts w:ascii="Times New Roman" w:eastAsia="Times New Roman" w:hAnsi="Times New Roman" w:cs="Times New Roman"/>
+          <w:color w:val="0F1115"/>
+          <w:kern w:val="0"/>
+          <w14:ligatures w14:val="none"/>
+        </w:rPr>
+        <w:t xml:space="preserve"> </w:t>
+      </w:r>
+      <w:proofErr w:type="gramStart"/>
+      <w:r>
+        <w:rPr>
+          <w:rFonts w:ascii="Times New Roman" w:eastAsia="Times New Roman" w:hAnsi="Times New Roman" w:cs="Times New Roman"/>
+          <w:color w:val="0F1115"/>
+          <w:kern w:val="0"/>
+          <w14:ligatures w14:val="none"/>
+        </w:rPr>
+        <w:t>and .</w:t>
+      </w:r>
+      <w:proofErr w:type="spellStart"/>
+      <w:r>
+        <w:rPr>
+          <w:rFonts w:ascii="Times New Roman" w:eastAsia="Times New Roman" w:hAnsi="Times New Roman" w:cs="Times New Roman"/>
+          <w:color w:val="0F1115"/>
+          <w:kern w:val="0"/>
+          <w14:ligatures w14:val="none"/>
+        </w:rPr>
+        <w:t>env</w:t>
+      </w:r>
+      <w:proofErr w:type="gramEnd"/>
+      <w:r>
+        <w:rPr>
+          <w:rFonts w:ascii="Times New Roman" w:eastAsia="Times New Roman" w:hAnsi="Times New Roman" w:cs="Times New Roman"/>
+          <w:color w:val="0F1115"/>
+          <w:kern w:val="0"/>
+          <w14:ligatures w14:val="none"/>
+        </w:rPr>
+        <w:t>.example</w:t>
+      </w:r>
+      <w:proofErr w:type="spellEnd"/>
+      <w:r>
+        <w:rPr>
+          <w:rFonts w:ascii="Times New Roman" w:eastAsia="Times New Roman" w:hAnsi="Times New Roman" w:cs="Times New Roman"/>
+          <w:color w:val="0F1115"/>
+          <w:kern w:val="0"/>
+          <w14:ligatures w14:val="none"/>
+        </w:rPr>
+        <w:t xml:space="preserve"> for storing environment variables</w:t>
       </w:r>
     </w:p>
     <w:p>
@@ -734,6 +794,7 @@
           <w14:ligatures w14:val="none"/>
         </w:rPr>
       </w:pPr>
+      <w:proofErr w:type="spellStart"/>
       <w:r>
         <w:rPr>
           <w:rFonts w:ascii="Times New Roman" w:eastAsia="Times New Roman" w:hAnsi="Times New Roman" w:cs="Times New Roman"/>
@@ -743,7 +804,19 @@
           <w:kern w:val="0"/>
           <w14:ligatures w14:val="none"/>
         </w:rPr>
-        <w:t>Roumaysae Jerari</w:t>
+        <w:t>Roumaysae</w:t>
+      </w:r>
+      <w:proofErr w:type="spellEnd"/>
+      <w:r>
+        <w:rPr>
+          <w:rFonts w:ascii="Times New Roman" w:eastAsia="Times New Roman" w:hAnsi="Times New Roman" w:cs="Times New Roman"/>
+          <w:b/>
+          <w:bCs/>
+          <w:color w:val="0F1115"/>
+          <w:kern w:val="0"/>
+          <w14:ligatures w14:val="none"/>
+        </w:rPr>
+        <w:t xml:space="preserve"> Jerari</w:t>
       </w:r>
       <w:r>
         <w:rPr>
@@ -776,7 +849,23 @@
           <w:rFonts w:ascii="Times New Roman" w:hAnsi="Times New Roman" w:cs="Times New Roman"/>
           <w:color w:val="0F1115"/>
         </w:rPr>
-        <w:t>1. Receipt Upload Button &amp; Veryfi Integration:</w:t>
+        <w:t xml:space="preserve">1. Receipt Upload Button &amp; </w:t>
+      </w:r>
+      <w:proofErr w:type="spellStart"/>
+      <w:r>
+        <w:rPr>
+          <w:rFonts w:ascii="Times New Roman" w:hAnsi="Times New Roman" w:cs="Times New Roman"/>
+          <w:color w:val="0F1115"/>
+        </w:rPr>
+        <w:t>Veryfi</w:t>
+      </w:r>
+      <w:proofErr w:type="spellEnd"/>
+      <w:r>
+        <w:rPr>
+          <w:rFonts w:ascii="Times New Roman" w:hAnsi="Times New Roman" w:cs="Times New Roman"/>
+          <w:color w:val="0F1115"/>
+        </w:rPr>
+        <w:t xml:space="preserve"> Integration:</w:t>
       </w:r>
     </w:p>
     <w:p>
@@ -794,7 +883,21 @@
         <w:rPr>
           <w:color w:val="0F1115"/>
         </w:rPr>
-        <w:t>Added an "Upload Receipt" button to the dashboard and connected Veryfi API to read text   from receipt images, fixing file paths so images upload correctly.</w:t>
+        <w:t xml:space="preserve">Added an "Upload Receipt" button to the dashboard and connected </w:t>
+      </w:r>
+      <w:proofErr w:type="spellStart"/>
+      <w:r>
+        <w:rPr>
+          <w:color w:val="0F1115"/>
+        </w:rPr>
+        <w:t>Veryfi</w:t>
+      </w:r>
+      <w:proofErr w:type="spellEnd"/>
+      <w:r>
+        <w:rPr>
+          <w:color w:val="0F1115"/>
+        </w:rPr>
+        <w:t xml:space="preserve"> API to read text   from receipt images, fixing file paths so images upload correctly.</w:t>
       </w:r>
     </w:p>
     <w:p>
@@ -877,9 +980,11 @@
         </w:rPr>
         <w:t>Created </w:t>
       </w:r>
+      <w:proofErr w:type="spellStart"/>
       <w:r>
         <w:t>receipt_line_items</w:t>
       </w:r>
+      <w:proofErr w:type="spellEnd"/>
       <w:r>
         <w:rPr>
           <w:color w:val="0F1115"/>
@@ -988,9 +1093,11 @@
         </w:rPr>
         <w:t>Added a "Send Feedback" button, created a popup modal form, and connected it to the </w:t>
       </w:r>
+      <w:proofErr w:type="spellStart"/>
       <w:r>
         <w:t>users_feedbackss</w:t>
       </w:r>
+      <w:proofErr w:type="spellEnd"/>
       <w:r>
         <w:rPr>
           <w:color w:val="0F1115"/>
@@ -1080,13 +1187,7 @@
         <w:rPr>
           <w:color w:val="0F1115"/>
         </w:rPr>
-        <w:t>8</w:t>
-      </w:r>
-      <w:r>
-        <w:rPr>
-          <w:color w:val="0F1115"/>
-        </w:rPr>
-        <w:t xml:space="preserve">. </w:t>
+        <w:t xml:space="preserve">8. </w:t>
       </w:r>
       <w:r>
         <w:rPr>
@@ -1113,13 +1214,7 @@
         <w:rPr>
           <w:color w:val="0F1115"/>
         </w:rPr>
-        <w:t>9</w:t>
-      </w:r>
-      <w:r>
-        <w:rPr>
-          <w:color w:val="0F1115"/>
-        </w:rPr>
-        <w:t>. added the ability to edit/delete existing expenses and incomes directly from the dashboard.</w:t>
+        <w:t>9. added the ability to edit/delete existing expenses and incomes directly from the dashboard.</w:t>
       </w:r>
     </w:p>
     <w:p>
@@ -1200,7 +1295,35 @@
         <w:rPr>
           <w:color w:val="0F1115"/>
         </w:rPr>
-        <w:t xml:space="preserve"> ( for AI scanner to the user ).</w:t>
+        <w:t xml:space="preserve"> </w:t>
+      </w:r>
+      <w:proofErr w:type="gramStart"/>
+      <w:r>
+        <w:rPr>
+          <w:color w:val="0F1115"/>
+        </w:rPr>
+        <w:t>( for</w:t>
+      </w:r>
+      <w:proofErr w:type="gramEnd"/>
+      <w:r>
+        <w:rPr>
+          <w:color w:val="0F1115"/>
+        </w:rPr>
+        <w:t xml:space="preserve"> AI scanner to the </w:t>
+      </w:r>
+      <w:proofErr w:type="gramStart"/>
+      <w:r>
+        <w:rPr>
+          <w:color w:val="0F1115"/>
+        </w:rPr>
+        <w:t>user )</w:t>
+      </w:r>
+      <w:proofErr w:type="gramEnd"/>
+      <w:r>
+        <w:rPr>
+          <w:color w:val="0F1115"/>
+        </w:rPr>
+        <w:t>.</w:t>
       </w:r>
     </w:p>
     <w:p>
@@ -1309,13 +1432,144 @@
         <w:jc w:val="both"/>
         <w:rPr>
           <w:rFonts w:ascii="Times New Roman" w:eastAsia="Times New Roman" w:hAnsi="Times New Roman" w:cs="Times New Roman"/>
-          <w:b/>
-          <w:bCs/>
-          <w:color w:val="0F1115"/>
-          <w:kern w:val="0"/>
-          <w14:ligatures w14:val="none"/>
-        </w:rPr>
-      </w:pPr>
+          <w:color w:val="0F1115"/>
+          <w:kern w:val="0"/>
+          <w14:ligatures w14:val="none"/>
+        </w:rPr>
+      </w:pPr>
+      <w:r>
+        <w:rPr>
+          <w:rFonts w:ascii="Times New Roman" w:eastAsia="Times New Roman" w:hAnsi="Times New Roman" w:cs="Times New Roman"/>
+          <w:color w:val="0F1115"/>
+          <w:kern w:val="0"/>
+          <w14:ligatures w14:val="none"/>
+        </w:rPr>
+        <w:t>Created Google Login API Client ID</w:t>
+      </w:r>
+    </w:p>
+    <w:p>
+      <w:pPr>
+        <w:pStyle w:val="ListParagraph"/>
+        <w:numPr>
+          <w:ilvl w:val="0"/>
+          <w:numId w:val="2"/>
+        </w:numPr>
+        <w:spacing w:after="120" w:line="480" w:lineRule="auto"/>
+        <w:jc w:val="both"/>
+        <w:rPr>
+          <w:rFonts w:ascii="Times New Roman" w:eastAsia="Times New Roman" w:hAnsi="Times New Roman" w:cs="Times New Roman"/>
+          <w:color w:val="0F1115"/>
+          <w:kern w:val="0"/>
+          <w14:ligatures w14:val="none"/>
+        </w:rPr>
+      </w:pPr>
+      <w:r>
+        <w:rPr>
+          <w:rFonts w:ascii="Times New Roman" w:eastAsia="Times New Roman" w:hAnsi="Times New Roman" w:cs="Times New Roman"/>
+          <w:color w:val="0F1115"/>
+          <w:kern w:val="0"/>
+          <w14:ligatures w14:val="none"/>
+        </w:rPr>
+        <w:t xml:space="preserve">Created </w:t>
+      </w:r>
+      <w:hyperlink r:id="rId5" w:history="1">
+        <w:r>
+          <w:rPr>
+            <w:rStyle w:val="Hyperlink"/>
+            <w:rFonts w:ascii="Times New Roman" w:eastAsia="Times New Roman" w:hAnsi="Times New Roman" w:cs="Times New Roman"/>
+            <w:kern w:val="0"/>
+            <w14:ligatures w14:val="none"/>
+          </w:rPr>
+          <w:t>Dollardoodledev@gmail.com</w:t>
+        </w:r>
+      </w:hyperlink>
+      <w:r>
+        <w:rPr>
+          <w:rFonts w:ascii="Times New Roman" w:eastAsia="Times New Roman" w:hAnsi="Times New Roman" w:cs="Times New Roman"/>
+          <w:color w:val="0F1115"/>
+          <w:kern w:val="0"/>
+          <w14:ligatures w14:val="none"/>
+        </w:rPr>
+        <w:t xml:space="preserve"> email account</w:t>
+      </w:r>
+    </w:p>
+    <w:p>
+      <w:pPr>
+        <w:pStyle w:val="ListParagraph"/>
+        <w:numPr>
+          <w:ilvl w:val="0"/>
+          <w:numId w:val="2"/>
+        </w:numPr>
+        <w:spacing w:after="120" w:line="480" w:lineRule="auto"/>
+        <w:jc w:val="both"/>
+        <w:rPr>
+          <w:rFonts w:ascii="Times New Roman" w:eastAsia="Times New Roman" w:hAnsi="Times New Roman" w:cs="Times New Roman"/>
+          <w:color w:val="0F1115"/>
+          <w:kern w:val="0"/>
+          <w14:ligatures w14:val="none"/>
+        </w:rPr>
+      </w:pPr>
+      <w:r>
+        <w:rPr>
+          <w:rFonts w:ascii="Times New Roman" w:eastAsia="Times New Roman" w:hAnsi="Times New Roman" w:cs="Times New Roman"/>
+          <w:color w:val="0F1115"/>
+          <w:kern w:val="0"/>
+          <w14:ligatures w14:val="none"/>
+        </w:rPr>
+        <w:t>Assisted with styling/CSS/logo design</w:t>
+      </w:r>
+    </w:p>
+    <w:p>
+      <w:pPr>
+        <w:pStyle w:val="ListParagraph"/>
+        <w:numPr>
+          <w:ilvl w:val="0"/>
+          <w:numId w:val="2"/>
+        </w:numPr>
+        <w:spacing w:after="120" w:line="480" w:lineRule="auto"/>
+        <w:jc w:val="both"/>
+        <w:rPr>
+          <w:rFonts w:ascii="Times New Roman" w:eastAsia="Times New Roman" w:hAnsi="Times New Roman" w:cs="Times New Roman"/>
+          <w:color w:val="0F1115"/>
+          <w:kern w:val="0"/>
+          <w14:ligatures w14:val="none"/>
+        </w:rPr>
+      </w:pPr>
+      <w:r>
+        <w:rPr>
+          <w:rFonts w:ascii="Times New Roman" w:eastAsia="Times New Roman" w:hAnsi="Times New Roman" w:cs="Times New Roman"/>
+          <w:color w:val="0F1115"/>
+          <w:kern w:val="0"/>
+          <w14:ligatures w14:val="none"/>
+        </w:rPr>
+        <w:t>Designed presentation slides</w:t>
+      </w:r>
+    </w:p>
+    <w:p>
+      <w:pPr>
+        <w:pStyle w:val="ListParagraph"/>
+        <w:numPr>
+          <w:ilvl w:val="0"/>
+          <w:numId w:val="2"/>
+        </w:numPr>
+        <w:spacing w:after="120" w:line="480" w:lineRule="auto"/>
+        <w:jc w:val="both"/>
+        <w:rPr>
+          <w:rFonts w:ascii="Times New Roman" w:eastAsia="Times New Roman" w:hAnsi="Times New Roman" w:cs="Times New Roman"/>
+          <w:color w:val="0F1115"/>
+          <w:kern w:val="0"/>
+          <w14:ligatures w14:val="none"/>
+        </w:rPr>
+      </w:pPr>
+      <w:r>
+        <w:rPr>
+          <w:rFonts w:ascii="Times New Roman" w:eastAsia="Times New Roman" w:hAnsi="Times New Roman" w:cs="Times New Roman"/>
+          <w:color w:val="0F1115"/>
+          <w:kern w:val="0"/>
+          <w14:ligatures w14:val="none"/>
+        </w:rPr>
+        <w:t>Created Dashboard Graph/Visualization feature (to be implemented in further phases)</w:t>
+      </w:r>
     </w:p>
     <w:p>
       <w:pPr>
@@ -1366,7 +1620,7 @@
 </file>
 
 <file path=word/numbering.xml><?xml version="1.0" encoding="utf-8"?>
-<w:numbering xmlns:wpc="http://schemas.microsoft.com/office/word/2010/wordprocessingCanvas" xmlns:cx="http://schemas.microsoft.com/office/drawing/2014/chartex" xmlns:cx1="http://schemas.microsoft.com/office/drawing/2015/9/8/chartex" xmlns:cx2="http://schemas.microsoft.com/office/drawing/2015/10/21/chartex" xmlns:cx3="http://schemas.microsoft.com/office/drawing/2016/5/9/chartex" xmlns:cx4="http://schemas.microsoft.com/office/drawing/2016/5/10/chartex" xmlns:cx5="http://schemas.microsoft.com/office/drawing/2016/5/11/chartex" xmlns:cx6="http://schemas.microsoft.com/office/drawing/2016/5/12/chartex" xmlns:cx7="http://schemas.microsoft.com/office/drawing/2016/5/13/chartex" xmlns:cx8="http://schemas.microsoft.com/office/drawing/2016/5/14/chartex" xmlns:mc="http://schemas.openxmlformats.org/markup-compatibility/2006" xmlns:aink="http://schemas.microsoft.com/office/drawing/2016/ink" xmlns:am3d="http://schemas.microsoft.com/office/drawing/2017/model3d" xmlns:o="urn:schemas-microsoft-com:office:office" xmlns:oel="http://schemas.microsoft.com/office/2019/extlst" xmlns:r="http://schemas.openxmlformats.org/officeDocument/2006/relationships" xmlns:m="http://schemas.openxmlformats.org/officeDocument/2006/math" xmlns:v="urn:schemas-microsoft-com:vml" xmlns:wp14="http://schemas.microsoft.com/office/word/2010/wordprocessingDrawing" xmlns:wp="http://schemas.openxmlformats.org/drawingml/2006/wordprocessingDrawing" xmlns:w10="urn:schemas-microsoft-com:office:word" xmlns:w="http://schemas.openxmlformats.org/wordprocessingml/2006/main" xmlns:w14="http://schemas.microsoft.com/office/word/2010/wordml" xmlns:w15="http://schemas.microsoft.com/office/word/2012/wordml" xmlns:w16cex="http://schemas.microsoft.com/office/word/2018/wordml/cex" xmlns:w16cid="http://schemas.microsoft.com/office/word/2016/wordml/cid" xmlns:w16="http://schemas.microsoft.com/office/word/2018/wordml" xmlns:w16du="http://schemas.microsoft.com/office/word/2023/wordml/word16du" xmlns:w16sdtdh="http://schemas.microsoft.com/office/word/2020/wordml/sdtdatahash" xmlns:w16se="http://schemas.microsoft.com/office/word/2015/wordml/symex" xmlns:wpg="http://schemas.microsoft.com/office/word/2010/wordprocessingGroup" xmlns:wpi="http://schemas.microsoft.com/office/word/2010/wordprocessingInk" xmlns:wne="http://schemas.microsoft.com/office/word/2006/wordml" xmlns:wps="http://schemas.microsoft.com/office/word/2010/wordprocessingShape" mc:Ignorable="w14 w15 w16se w16cid w16 w16cex w16sdtdh w16du wp14">
+<w:numbering xmlns:wpc="http://schemas.microsoft.com/office/word/2010/wordprocessingCanvas" xmlns:cx="http://schemas.microsoft.com/office/drawing/2014/chartex" xmlns:cx1="http://schemas.microsoft.com/office/drawing/2015/9/8/chartex" xmlns:cx2="http://schemas.microsoft.com/office/drawing/2015/10/21/chartex" xmlns:cx3="http://schemas.microsoft.com/office/drawing/2016/5/9/chartex" xmlns:cx4="http://schemas.microsoft.com/office/drawing/2016/5/10/chartex" xmlns:cx5="http://schemas.microsoft.com/office/drawing/2016/5/11/chartex" xmlns:cx6="http://schemas.microsoft.com/office/drawing/2016/5/12/chartex" xmlns:cx7="http://schemas.microsoft.com/office/drawing/2016/5/13/chartex" xmlns:cx8="http://schemas.microsoft.com/office/drawing/2016/5/14/chartex" xmlns:mc="http://schemas.openxmlformats.org/markup-compatibility/2006" xmlns:aink="http://schemas.microsoft.com/office/drawing/2016/ink" xmlns:am3d="http://schemas.microsoft.com/office/drawing/2017/model3d" xmlns:o="urn:schemas-microsoft-com:office:office" xmlns:oel="http://schemas.microsoft.com/office/2019/extlst" xmlns:r="http://schemas.openxmlformats.org/officeDocument/2006/relationships" xmlns:m="http://schemas.openxmlformats.org/officeDocument/2006/math" xmlns:v="urn:schemas-microsoft-com:vml" xmlns:wp14="http://schemas.microsoft.com/office/word/2010/wordprocessingDrawing" xmlns:wp="http://schemas.openxmlformats.org/drawingml/2006/wordprocessingDrawing" xmlns:w10="urn:schemas-microsoft-com:office:word" xmlns:w="http://schemas.openxmlformats.org/wordprocessingml/2006/main" xmlns:w14="http://schemas.microsoft.com/office/word/2010/wordml" xmlns:w15="http://schemas.microsoft.com/office/word/2012/wordml" xmlns:w16cex="http://schemas.microsoft.com/office/word/2018/wordml/cex" xmlns:w16cid="http://schemas.microsoft.com/office/word/2016/wordml/cid" xmlns:w16="http://schemas.microsoft.com/office/word/2018/wordml" xmlns:w16du="http://schemas.microsoft.com/office/word/2023/wordml/word16du" xmlns:w16sdtdh="http://schemas.microsoft.com/office/word/2020/wordml/sdtdatahash" xmlns:w16sdtfl="http://schemas.microsoft.com/office/word/2024/wordml/sdtformatlock" xmlns:w16se="http://schemas.microsoft.com/office/word/2015/wordml/symex" xmlns:wpg="http://schemas.microsoft.com/office/word/2010/wordprocessingGroup" xmlns:wpi="http://schemas.microsoft.com/office/word/2010/wordprocessingInk" xmlns:wne="http://schemas.microsoft.com/office/word/2006/wordml" xmlns:wps="http://schemas.microsoft.com/office/word/2010/wordprocessingShape" mc:Ignorable="w14 w15 w16se w16cid w16 w16cex w16sdtdh w16sdtfl w16du wp14">
   <w:abstractNum w:abstractNumId="0" w15:restartNumberingAfterBreak="0">
     <w:nsid w:val="14D14587"/>
     <w:multiLevelType w:val="multilevel"/>
@@ -1791,7 +2045,7 @@
 </file>
 
 <file path=word/styles.xml><?xml version="1.0" encoding="utf-8"?>
-<w:styles xmlns:mc="http://schemas.openxmlformats.org/markup-compatibility/2006" xmlns:r="http://schemas.openxmlformats.org/officeDocument/2006/relationships" xmlns:w="http://schemas.openxmlformats.org/wordprocessingml/2006/main" xmlns:w14="http://schemas.microsoft.com/office/word/2010/wordml" xmlns:w15="http://schemas.microsoft.com/office/word/2012/wordml" xmlns:w16cex="http://schemas.microsoft.com/office/word/2018/wordml/cex" xmlns:w16cid="http://schemas.microsoft.com/office/word/2016/wordml/cid" xmlns:w16="http://schemas.microsoft.com/office/word/2018/wordml" xmlns:w16du="http://schemas.microsoft.com/office/word/2023/wordml/word16du" xmlns:w16sdtdh="http://schemas.microsoft.com/office/word/2020/wordml/sdtdatahash" xmlns:w16se="http://schemas.microsoft.com/office/word/2015/wordml/symex" mc:Ignorable="w14 w15 w16se w16cid w16 w16cex w16sdtdh w16du">
+<w:styles xmlns:mc="http://schemas.openxmlformats.org/markup-compatibility/2006" xmlns:r="http://schemas.openxmlformats.org/officeDocument/2006/relationships" xmlns:w="http://schemas.openxmlformats.org/wordprocessingml/2006/main" xmlns:w14="http://schemas.microsoft.com/office/word/2010/wordml" xmlns:w15="http://schemas.microsoft.com/office/word/2012/wordml" xmlns:w16cex="http://schemas.microsoft.com/office/word/2018/wordml/cex" xmlns:w16cid="http://schemas.microsoft.com/office/word/2016/wordml/cid" xmlns:w16="http://schemas.microsoft.com/office/word/2018/wordml" xmlns:w16du="http://schemas.microsoft.com/office/word/2023/wordml/word16du" xmlns:w16sdtdh="http://schemas.microsoft.com/office/word/2020/wordml/sdtdatahash" xmlns:w16sdtfl="http://schemas.microsoft.com/office/word/2024/wordml/sdtformatlock" xmlns:w16se="http://schemas.microsoft.com/office/word/2015/wordml/symex" mc:Ignorable="w14 w15 w16se w16cid w16 w16cex w16sdtdh w16sdtfl w16du">
   <w:docDefaults>
     <w:rPrDefault>
       <w:rPr>
@@ -2800,6 +3054,29 @@
       <w14:ligatures w14:val="none"/>
     </w:rPr>
   </w:style>
+  <w:style w:type="character" w:styleId="Hyperlink">
+    <w:name w:val="Hyperlink"/>
+    <w:basedOn w:val="DefaultParagraphFont"/>
+    <w:uiPriority w:val="99"/>
+    <w:unhideWhenUsed/>
+    <w:rsid w:val="00CD4675"/>
+    <w:rPr>
+      <w:color w:val="467886" w:themeColor="hyperlink"/>
+      <w:u w:val="single"/>
+    </w:rPr>
+  </w:style>
+  <w:style w:type="character" w:styleId="UnresolvedMention">
+    <w:name w:val="Unresolved Mention"/>
+    <w:basedOn w:val="DefaultParagraphFont"/>
+    <w:uiPriority w:val="99"/>
+    <w:semiHidden/>
+    <w:unhideWhenUsed/>
+    <w:rsid w:val="00CD4675"/>
+    <w:rPr>
+      <w:color w:val="605E5C"/>
+      <w:shd w:val="clear" w:color="auto" w:fill="E1DFDD"/>
+    </w:rPr>
+  </w:style>
 </w:styles>
 </file>
 

</xml_diff>